<commit_message>
Fix slides for lecture 9 and 10
</commit_message>
<xml_diff>
--- a/SOFTWARE ENGINEERING/Individual Assignments/IndividualAssignment2.docx
+++ b/SOFTWARE ENGINEERING/Individual Assignments/IndividualAssignment2.docx
@@ -219,15 +219,19 @@
         <w:t xml:space="preserve">: </w:t>
       </w:r>
       <w:r>
-        <w:t xml:space="preserve">Your submission for this assignment should be in PDF format, following the provided template below. You will submit your work to Brightspace. Ensure that your document is </w:t>
-      </w:r>
-      <w:proofErr w:type="spellStart"/>
-      <w:r>
-        <w:t>wellstructured</w:t>
-      </w:r>
-      <w:proofErr w:type="spellEnd"/>
-      <w:r>
-        <w:t xml:space="preserve">, with each section clearly addressing its respective task and providing necessary details as outlined in the assignment instructions. Please refer to the template below. </w:t>
+        <w:t xml:space="preserve">Your submission for this assignment should be in PDF format, following the provided template below. You will submit your work to </w:t>
+      </w:r>
+      <w:r>
+        <w:t>Gradescope</w:t>
+      </w:r>
+      <w:r>
+        <w:t>. Ensure that your document is well</w:t>
+      </w:r>
+      <w:r>
+        <w:t xml:space="preserve"> </w:t>
+      </w:r>
+      <w:r>
+        <w:t xml:space="preserve">structured, with each section clearly addressing its respective task and providing necessary details as outlined in the assignment instructions. Please refer to the template below. </w:t>
       </w:r>
     </w:p>
     <w:p>

</xml_diff>